<commit_message>
update post gnu stow y add dos post de positron y  kitty
</commit_message>
<xml_diff>
--- a/_site/operating-system/2025-07-10-gestiona-tus-dotfiles-con-gnu-stow/index.docx
+++ b/_site/operating-system/2025-07-10-gestiona-tus-dotfiles-con-gnu-stow/index.docx
@@ -226,7 +226,7 @@
       </w:r>
     </w:p>
     <w:bookmarkEnd w:id="25"/>
-    <w:bookmarkStart w:id="48" w:name="firstheader"/>
+    <w:bookmarkStart w:id="26" w:name="firstheader"/>
     <w:p>
       <w:pPr>
         <w:pStyle w:val="Heading1"/>
@@ -395,22 +395,23 @@
         <w:t xml:space="preserve">transforma la gestión de dotfiles en algo simple y poderoso.</w:t>
       </w:r>
     </w:p>
-    <w:bookmarkStart w:id="29" w:name="qué-son-los-dotfiles-y-por-qué-importan"/>
+    <w:bookmarkEnd w:id="26"/>
+    <w:bookmarkStart w:id="30" w:name="qué-son-los-dotfiles-y-por-qué-importan"/>
+    <w:p>
+      <w:pPr>
+        <w:pStyle w:val="Heading1"/>
+      </w:pPr>
+      <w:r>
+        <w:t xml:space="preserve">1. ¿Qué son los Dotfiles y Por Qué Importan?</w:t>
+      </w:r>
+    </w:p>
+    <w:bookmarkStart w:id="27" w:name="definición-de-dotfiles-y-su-rol"/>
     <w:p>
       <w:pPr>
         <w:pStyle w:val="Heading2"/>
       </w:pPr>
       <w:r>
-        <w:t xml:space="preserve">0.1 ¿Qué son los Dotfiles y Por Qué Importan?</w:t>
-      </w:r>
-    </w:p>
-    <w:bookmarkStart w:id="26" w:name="definición-de-dotfiles-y-su-rol"/>
-    <w:p>
-      <w:pPr>
-        <w:pStyle w:val="Heading3"/>
-      </w:pPr>
-      <w:r>
-        <w:t xml:space="preserve">0.1.1 Definición de Dotfiles y su Rol</w:t>
+        <w:t xml:space="preserve">1.1 Definición de Dotfiles y su Rol</w:t>
       </w:r>
     </w:p>
     <w:p>
@@ -503,14 +504,14 @@
         <w:t xml:space="preserve">ajusta tu editor Vim. Estos archivos son el corazón de tu flujo de trabajo, ya que personalizan tus herramientas favoritas.</w:t>
       </w:r>
     </w:p>
-    <w:bookmarkEnd w:id="26"/>
-    <w:bookmarkStart w:id="27" w:name="impacto-en-la-productividad-del-usuario"/>
-    <w:p>
-      <w:pPr>
-        <w:pStyle w:val="Heading3"/>
-      </w:pPr>
-      <w:r>
-        <w:t xml:space="preserve">0.1.2 Impacto en la Productividad del Usuario</w:t>
+    <w:bookmarkEnd w:id="27"/>
+    <w:bookmarkStart w:id="28" w:name="impacto-en-la-productividad-del-usuario"/>
+    <w:p>
+      <w:pPr>
+        <w:pStyle w:val="Heading2"/>
+      </w:pPr>
+      <w:r>
+        <w:t xml:space="preserve">1.2 Impacto en la Productividad del Usuario</w:t>
       </w:r>
     </w:p>
     <w:p>
@@ -537,14 +538,14 @@
         <w:t xml:space="preserve">bien organizados te ahorra horas al replicar tu entorno en nuevas máquinas. Imagina configurar tu shell o editor desde cero tras reinstalar tu sistema: ¡es tedioso! Con una gestión adecuada, puedes clonar tus configuraciones y tener todo listo rápidamente. Esto es clave para desarrolladores que trabajan en múltiples dispositivos o entornos como servidores y laptops.</w:t>
       </w:r>
     </w:p>
-    <w:bookmarkEnd w:id="27"/>
-    <w:bookmarkStart w:id="28" w:name="problemas-de-la-gestión-manual"/>
-    <w:p>
-      <w:pPr>
-        <w:pStyle w:val="Heading3"/>
-      </w:pPr>
-      <w:r>
-        <w:t xml:space="preserve">0.1.3 Problemas de la Gestión Manual</w:t>
+    <w:bookmarkEnd w:id="28"/>
+    <w:bookmarkStart w:id="29" w:name="problemas-de-la-gestión-manual"/>
+    <w:p>
+      <w:pPr>
+        <w:pStyle w:val="Heading2"/>
+      </w:pPr>
+      <w:r>
+        <w:t xml:space="preserve">1.3 Problemas de la Gestión Manual</w:t>
       </w:r>
     </w:p>
     <w:p>
@@ -618,24 +619,24 @@
         <w:t xml:space="preserve">automáticamente, manteniendo todo sincronizado.</w:t>
       </w:r>
     </w:p>
-    <w:bookmarkEnd w:id="28"/>
     <w:bookmarkEnd w:id="29"/>
-    <w:bookmarkStart w:id="33" w:name="qué-es-gnu-stow-y-cómo-funciona"/>
+    <w:bookmarkEnd w:id="30"/>
+    <w:bookmarkStart w:id="34" w:name="qué-es-gnu-stow-y-cómo-funciona"/>
+    <w:p>
+      <w:pPr>
+        <w:pStyle w:val="Heading1"/>
+      </w:pPr>
+      <w:r>
+        <w:t xml:space="preserve">2. ¿Qué es GNU Stow y Cómo Funciona?</w:t>
+      </w:r>
+    </w:p>
+    <w:bookmarkStart w:id="31" w:name="X2b98d85f0daf9afeeec55860e7bd370ddcb8f14"/>
     <w:p>
       <w:pPr>
         <w:pStyle w:val="Heading2"/>
       </w:pPr>
       <w:r>
-        <w:t xml:space="preserve">0.2 ¿Qué es GNU Stow y Cómo Funciona?</w:t>
-      </w:r>
-    </w:p>
-    <w:bookmarkStart w:id="30" w:name="X2b98d85f0daf9afeeec55860e7bd370ddcb8f14"/>
-    <w:p>
-      <w:pPr>
-        <w:pStyle w:val="Heading3"/>
-      </w:pPr>
-      <w:r>
-        <w:t xml:space="preserve">0.2.1 Introducción a GNU Stow: Gestión de Symlinks</w:t>
+        <w:t xml:space="preserve">2.1 Introducción a GNU Stow: Gestión de Symlinks</w:t>
       </w:r>
     </w:p>
     <w:p>
@@ -721,14 +722,14 @@
         <w:t xml:space="preserve">) y crea enlaces a las ubicaciones correctas. Esto asegura que tus aplicaciones usen las configuraciones sin duplicar archivos, y los cambios se reflejan en el repositorio.</w:t>
       </w:r>
     </w:p>
-    <w:bookmarkEnd w:id="30"/>
-    <w:bookmarkStart w:id="31" w:name="concepto-de-paquetes-en-stow"/>
-    <w:p>
-      <w:pPr>
-        <w:pStyle w:val="Heading3"/>
-      </w:pPr>
-      <w:r>
-        <w:t xml:space="preserve">0.2.2 Concepto de Paquetes en Stow</w:t>
+    <w:bookmarkEnd w:id="31"/>
+    <w:bookmarkStart w:id="32" w:name="concepto-de-paquetes-en-stow"/>
+    <w:p>
+      <w:pPr>
+        <w:pStyle w:val="Heading2"/>
+      </w:pPr>
+      <w:r>
+        <w:t xml:space="preserve">2.2 Concepto de Paquetes en Stow</w:t>
       </w:r>
     </w:p>
     <w:p>
@@ -1069,14 +1070,14 @@
         <w:t xml:space="preserve">└── install.sh</w:t>
       </w:r>
     </w:p>
-    <w:bookmarkEnd w:id="31"/>
-    <w:bookmarkStart w:id="32" w:name="beneficios-de-usar-stow-para-dotfiles"/>
-    <w:p>
-      <w:pPr>
-        <w:pStyle w:val="Heading3"/>
-      </w:pPr>
-      <w:r>
-        <w:t xml:space="preserve">0.2.3 Beneficios de Usar Stow para Dotfiles</w:t>
+    <w:bookmarkEnd w:id="32"/>
+    <w:bookmarkStart w:id="33" w:name="beneficios-de-usar-stow-para-dotfiles"/>
+    <w:p>
+      <w:pPr>
+        <w:pStyle w:val="Heading2"/>
+      </w:pPr>
+      <w:r>
+        <w:t xml:space="preserve">2.3 Beneficios de Usar Stow para Dotfiles</w:t>
       </w:r>
     </w:p>
     <w:p>
@@ -1217,24 +1218,24 @@
         <w:t xml:space="preserve">: Funciona en Linux, macOS y WSL, ideal para entornos mixtos.</w:t>
       </w:r>
     </w:p>
-    <w:bookmarkEnd w:id="32"/>
     <w:bookmarkEnd w:id="33"/>
-    <w:bookmarkStart w:id="38" w:name="X28ed5b971baefd6b518566b72b6d9d663dd5014"/>
+    <w:bookmarkEnd w:id="34"/>
+    <w:bookmarkStart w:id="39" w:name="X28ed5b971baefd6b518566b72b6d9d663dd5014"/>
+    <w:p>
+      <w:pPr>
+        <w:pStyle w:val="Heading1"/>
+      </w:pPr>
+      <w:r>
+        <w:t xml:space="preserve">3. Guía Práctica: Configura tus Dotfiles con Stow</w:t>
+      </w:r>
+    </w:p>
+    <w:bookmarkStart w:id="35" w:name="paso-1-instala-gnu-stow-en-tu-sistema"/>
     <w:p>
       <w:pPr>
         <w:pStyle w:val="Heading2"/>
       </w:pPr>
       <w:r>
-        <w:t xml:space="preserve">0.3 Guía Práctica: Configura tus Dotfiles con Stow</w:t>
-      </w:r>
-    </w:p>
-    <w:bookmarkStart w:id="34" w:name="paso-1-instala-gnu-stow-en-tu-sistema"/>
-    <w:p>
-      <w:pPr>
-        <w:pStyle w:val="Heading3"/>
-      </w:pPr>
-      <w:r>
-        <w:t xml:space="preserve">0.3.1 Paso 1: Instala GNU Stow en tu Sistema</w:t>
+        <w:t xml:space="preserve">3.1 Paso 1: Instala GNU Stow en tu Sistema</w:t>
       </w:r>
     </w:p>
     <w:p>
@@ -1513,14 +1514,14 @@
         <w:t xml:space="preserve">), estás listo.</w:t>
       </w:r>
     </w:p>
-    <w:bookmarkEnd w:id="34"/>
-    <w:bookmarkStart w:id="35" w:name="X0a32d407e839e3ef5685c86e589018adebb00df"/>
-    <w:p>
-      <w:pPr>
-        <w:pStyle w:val="Heading3"/>
-      </w:pPr>
-      <w:r>
-        <w:t xml:space="preserve">0.3.2 Paso 2: Crea y Organiza tu Repositorio de Dotfiles</w:t>
+    <w:bookmarkEnd w:id="35"/>
+    <w:bookmarkStart w:id="36" w:name="X0a32d407e839e3ef5685c86e589018adebb00df"/>
+    <w:p>
+      <w:pPr>
+        <w:pStyle w:val="Heading2"/>
+      </w:pPr>
+      <w:r>
+        <w:t xml:space="preserve">3.2 Paso 2: Crea y Organiza tu Repositorio de Dotfiles</w:t>
       </w:r>
     </w:p>
     <w:p>
@@ -1990,14 +1991,14 @@
         <w:t xml:space="preserve">Tu repositorio ahora está organizado y listo para Stow.</w:t>
       </w:r>
     </w:p>
-    <w:bookmarkEnd w:id="35"/>
-    <w:bookmarkStart w:id="36" w:name="X3e8d4e7088085aad0ed7cbb12462840c54cb6d8"/>
-    <w:p>
-      <w:pPr>
-        <w:pStyle w:val="Heading3"/>
-      </w:pPr>
-      <w:r>
-        <w:t xml:space="preserve">0.3.3 Paso 3: Usa Stow para Enlazar Configuraciones</w:t>
+    <w:bookmarkEnd w:id="36"/>
+    <w:bookmarkStart w:id="37" w:name="X3e8d4e7088085aad0ed7cbb12462840c54cb6d8"/>
+    <w:p>
+      <w:pPr>
+        <w:pStyle w:val="Heading2"/>
+      </w:pPr>
+      <w:r>
+        <w:t xml:space="preserve">3.3 Paso 3: Usa Stow para Enlazar Configuraciones</w:t>
       </w:r>
     </w:p>
     <w:p>
@@ -2338,14 +2339,14 @@
         <w:t xml:space="preserve"> git zsh nvim</w:t>
       </w:r>
     </w:p>
-    <w:bookmarkEnd w:id="36"/>
-    <w:bookmarkStart w:id="37" w:name="Xd7e448ad03580b74cd4628979cea3d50883cd8c"/>
-    <w:p>
-      <w:pPr>
-        <w:pStyle w:val="Heading3"/>
-      </w:pPr>
-      <w:r>
-        <w:t xml:space="preserve">0.3.4 Paso 4: Automatiza con un Script de Instalación</w:t>
+    <w:bookmarkEnd w:id="37"/>
+    <w:bookmarkStart w:id="38" w:name="Xd7e448ad03580b74cd4628979cea3d50883cd8c"/>
+    <w:p>
+      <w:pPr>
+        <w:pStyle w:val="Heading2"/>
+      </w:pPr>
+      <w:r>
+        <w:t xml:space="preserve">3.4 Paso 4: Automatiza con un Script de Instalación</w:t>
       </w:r>
     </w:p>
     <w:p>
@@ -2907,24 +2908,24 @@
         <w:t xml:space="preserve">Este script simplifica el despliegue en cualquier máquina.</w:t>
       </w:r>
     </w:p>
-    <w:bookmarkEnd w:id="37"/>
     <w:bookmarkEnd w:id="38"/>
-    <w:bookmarkStart w:id="42" w:name="consejos-avanzados-para-optimizar-stow"/>
+    <w:bookmarkEnd w:id="39"/>
+    <w:bookmarkStart w:id="43" w:name="consejos-avanzados-para-optimizar-stow"/>
+    <w:p>
+      <w:pPr>
+        <w:pStyle w:val="Heading1"/>
+      </w:pPr>
+      <w:r>
+        <w:t xml:space="preserve">4. Consejos Avanzados para Optimizar Stow</w:t>
+      </w:r>
+    </w:p>
+    <w:bookmarkStart w:id="40" w:name="manejo-de-conflictos-con-adopt"/>
     <w:p>
       <w:pPr>
         <w:pStyle w:val="Heading2"/>
       </w:pPr>
       <w:r>
-        <w:t xml:space="preserve">0.4 Consejos Avanzados para Optimizar Stow</w:t>
-      </w:r>
-    </w:p>
-    <w:bookmarkStart w:id="39" w:name="manejo-de-conflictos-con-adopt"/>
-    <w:p>
-      <w:pPr>
-        <w:pStyle w:val="Heading3"/>
-      </w:pPr>
-      <w:r>
-        <w:t xml:space="preserve">0.4.1 Manejo de Conflictos con –adopt</w:t>
+        <w:t xml:space="preserve">4.1 Manejo de Conflictos con –adopt</w:t>
       </w:r>
     </w:p>
     <w:p>
@@ -3160,14 +3161,14 @@
         <w:t xml:space="preserve">).</w:t>
       </w:r>
     </w:p>
-    <w:bookmarkEnd w:id="39"/>
-    <w:bookmarkStart w:id="40" w:name="desvinculación-de-paquetes-con--d"/>
-    <w:p>
-      <w:pPr>
-        <w:pStyle w:val="Heading3"/>
-      </w:pPr>
-      <w:r>
-        <w:t xml:space="preserve">0.4.2 Desvinculación de Paquetes con -D</w:t>
+    <w:bookmarkEnd w:id="40"/>
+    <w:bookmarkStart w:id="41" w:name="desvinculación-de-paquetes-con--d"/>
+    <w:p>
+      <w:pPr>
+        <w:pStyle w:val="Heading2"/>
+      </w:pPr>
+      <w:r>
+        <w:t xml:space="preserve">4.2 Desvinculación de Paquetes con -D</w:t>
       </w:r>
     </w:p>
     <w:p>
@@ -3333,14 +3334,14 @@
         <w:t xml:space="preserve">permanece.</w:t>
       </w:r>
     </w:p>
-    <w:bookmarkEnd w:id="40"/>
-    <w:bookmarkStart w:id="41" w:name="Xa58ac8d63070b4246447b117a08b82425bf82e8"/>
-    <w:p>
-      <w:pPr>
-        <w:pStyle w:val="Heading3"/>
-      </w:pPr>
-      <w:r>
-        <w:t xml:space="preserve">0.4.3 Compatibilidad Multiplataforma y Portabilidad</w:t>
+    <w:bookmarkEnd w:id="41"/>
+    <w:bookmarkStart w:id="42" w:name="Xa58ac8d63070b4246447b117a08b82425bf82e8"/>
+    <w:p>
+      <w:pPr>
+        <w:pStyle w:val="Heading2"/>
+      </w:pPr>
+      <w:r>
+        <w:t xml:space="preserve">4.3 Compatibilidad Multiplataforma y Portabilidad</w:t>
       </w:r>
     </w:p>
     <w:p>
@@ -3560,24 +3561,24 @@
         <w:t xml:space="preserve">Esto asegura que solo uses configuraciones relevantes por máquina.</w:t>
       </w:r>
     </w:p>
-    <w:bookmarkEnd w:id="41"/>
     <w:bookmarkEnd w:id="42"/>
-    <w:bookmarkStart w:id="46" w:name="X03e707be365dfdc96ae939bc14408732d44dc3a"/>
+    <w:bookmarkEnd w:id="43"/>
+    <w:bookmarkStart w:id="47" w:name="X03e707be365dfdc96ae939bc14408732d44dc3a"/>
+    <w:p>
+      <w:pPr>
+        <w:pStyle w:val="Heading1"/>
+      </w:pPr>
+      <w:r>
+        <w:t xml:space="preserve">5. Alternativas a GNU Stow: ¿Qué Opciones Existen?</w:t>
+      </w:r>
+    </w:p>
+    <w:bookmarkStart w:id="44" w:name="Xc56fa471a282a352e61bbf2782b7cb33fc79437"/>
     <w:p>
       <w:pPr>
         <w:pStyle w:val="Heading2"/>
       </w:pPr>
       <w:r>
-        <w:t xml:space="preserve">0.5 Alternativas a GNU Stow: ¿Qué Opciones Existen?</w:t>
-      </w:r>
-    </w:p>
-    <w:bookmarkStart w:id="43" w:name="Xc56fa471a282a352e61bbf2782b7cb33fc79437"/>
-    <w:p>
-      <w:pPr>
-        <w:pStyle w:val="Heading3"/>
-      </w:pPr>
-      <w:r>
-        <w:t xml:space="preserve">0.5.1 Repositorios Git Bare: Simplicidad y Riesgos</w:t>
+        <w:t xml:space="preserve">5.1 Repositorios Git Bare: Simplicidad y Riesgos</w:t>
       </w:r>
     </w:p>
     <w:p>
@@ -3753,14 +3754,14 @@
         <w:t xml:space="preserve">.</w:t>
       </w:r>
     </w:p>
-    <w:bookmarkEnd w:id="43"/>
-    <w:bookmarkStart w:id="44" w:name="chezmoi-y-yadm-herramientas-modernas"/>
-    <w:p>
-      <w:pPr>
-        <w:pStyle w:val="Heading3"/>
-      </w:pPr>
-      <w:r>
-        <w:t xml:space="preserve">0.5.2 Chezmoi y YADM: Herramientas Modernas</w:t>
+    <w:bookmarkEnd w:id="44"/>
+    <w:bookmarkStart w:id="45" w:name="chezmoi-y-yadm-herramientas-modernas"/>
+    <w:p>
+      <w:pPr>
+        <w:pStyle w:val="Heading2"/>
+      </w:pPr>
+      <w:r>
+        <w:t xml:space="preserve">5.2 Chezmoi y YADM: Herramientas Modernas</w:t>
       </w:r>
     </w:p>
     <w:p>
@@ -3902,14 +3903,14 @@
         <w:t xml:space="preserve">: Mayor curva de aprendizaje.</w:t>
       </w:r>
     </w:p>
-    <w:bookmarkEnd w:id="44"/>
-    <w:bookmarkStart w:id="45" w:name="home-manager-configuración-declarativa"/>
-    <w:p>
-      <w:pPr>
-        <w:pStyle w:val="Heading3"/>
-      </w:pPr>
-      <w:r>
-        <w:t xml:space="preserve">0.5.3 Home Manager: Configuración Declarativa</w:t>
+    <w:bookmarkEnd w:id="45"/>
+    <w:bookmarkStart w:id="46" w:name="home-manager-configuración-declarativa"/>
+    <w:p>
+      <w:pPr>
+        <w:pStyle w:val="Heading2"/>
+      </w:pPr>
+      <w:r>
+        <w:t xml:space="preserve">5.3 Home Manager: Configuración Declarativa</w:t>
       </w:r>
     </w:p>
     <w:p>
@@ -3975,15 +3976,15 @@
         <w:t xml:space="preserve">: Complejo, requiere aprender Nix.</w:t>
       </w:r>
     </w:p>
-    <w:bookmarkEnd w:id="45"/>
     <w:bookmarkEnd w:id="46"/>
-    <w:bookmarkStart w:id="47" w:name="conclusión-controla-tu-entorno-digital"/>
-    <w:p>
-      <w:pPr>
-        <w:pStyle w:val="Heading2"/>
-      </w:pPr>
-      <w:r>
-        <w:t xml:space="preserve">0.6 Conclusión: Controla tu Entorno Digital</w:t>
+    <w:bookmarkEnd w:id="47"/>
+    <w:bookmarkStart w:id="48" w:name="conclusión"/>
+    <w:p>
+      <w:pPr>
+        <w:pStyle w:val="Heading1"/>
+      </w:pPr>
+      <w:r>
+        <w:t xml:space="preserve">6. Conclusión</w:t>
       </w:r>
     </w:p>
     <w:p>
@@ -4035,7 +4036,6 @@
         <w:t xml:space="preserve">y personaliza tu flujo de trabajo hoy! Comparte tus trucos o configuraciones favoritas en los comentarios.</w:t>
       </w:r>
     </w:p>
-    <w:bookmarkEnd w:id="47"/>
     <w:bookmarkEnd w:id="48"/>
     <w:bookmarkStart w:id="83" w:name="publicaciones-similares"/>
     <w:p>
@@ -4043,7 +4043,7 @@
         <w:pStyle w:val="Heading1"/>
       </w:pPr>
       <w:r>
-        <w:t xml:space="preserve">1. Publicaciones Similares</w:t>
+        <w:t xml:space="preserve">7. Publicaciones Similares</w:t>
       </w:r>
     </w:p>
     <w:p>

</xml_diff>